<commit_message>
update search and searchAgents files
</commit_message>
<xml_diff>
--- a/search/P1.docx
+++ b/search/P1.docx
@@ -134,11 +134,12 @@
       <w:r>
         <w:rPr>
           <w:rFonts w:ascii="Times New Roman" w:eastAsia="Times New Roman" w:hAnsi="Times New Roman" w:cs="Times New Roman"/>
+          <w:noProof/>
           <w:sz w:val="24"/>
           <w:szCs w:val="24"/>
         </w:rPr>
-        <w:pict w14:anchorId="32F8A5DD">
-          <v:rect id="_x0000_i1025" style="width:0;height:1.5pt" o:hrstd="t" o:hr="t" fillcolor="#a0a0a0" stroked="f"/>
+        <w:pict w14:anchorId="029FA4BB">
+          <v:rect id="_x0000_i1035" alt="" style="width:468pt;height:.05pt;mso-width-percent:0;mso-height-percent:0;mso-width-percent:0;mso-height-percent:0" o:hrstd="t" o:hr="t" fillcolor="#a0a0a0" stroked="f"/>
         </w:pict>
       </w:r>
     </w:p>
@@ -2200,11 +2201,12 @@
       <w:r>
         <w:rPr>
           <w:rFonts w:ascii="Times New Roman" w:eastAsia="Times New Roman" w:hAnsi="Times New Roman" w:cs="Times New Roman"/>
+          <w:noProof/>
           <w:sz w:val="24"/>
           <w:szCs w:val="24"/>
         </w:rPr>
-        <w:pict w14:anchorId="7B71F267">
-          <v:rect id="_x0000_i1026" style="width:0;height:1.5pt" o:hrstd="t" o:hr="t" fillcolor="#a0a0a0" stroked="f"/>
+        <w:pict w14:anchorId="1B371E04">
+          <v:rect id="_x0000_i1034" alt="" style="width:468pt;height:.05pt;mso-width-percent:0;mso-height-percent:0;mso-width-percent:0;mso-height-percent:0" o:hrstd="t" o:hr="t" fillcolor="#a0a0a0" stroked="f"/>
         </w:pict>
       </w:r>
     </w:p>
@@ -2993,11 +2995,12 @@
       <w:r>
         <w:rPr>
           <w:rFonts w:ascii="Times New Roman" w:eastAsia="Times New Roman" w:hAnsi="Times New Roman" w:cs="Times New Roman"/>
+          <w:noProof/>
           <w:sz w:val="24"/>
           <w:szCs w:val="24"/>
         </w:rPr>
-        <w:pict w14:anchorId="5D6D57AC">
-          <v:rect id="_x0000_i1027" style="width:0;height:1.5pt" o:hrstd="t" o:hr="t" fillcolor="#a0a0a0" stroked="f"/>
+        <w:pict w14:anchorId="08D2FEA4">
+          <v:rect id="_x0000_i1033" alt="" style="width:468pt;height:.05pt;mso-width-percent:0;mso-height-percent:0;mso-width-percent:0;mso-height-percent:0" o:hrstd="t" o:hr="t" fillcolor="#a0a0a0" stroked="f"/>
         </w:pict>
       </w:r>
     </w:p>
@@ -4124,11 +4127,12 @@
       <w:r>
         <w:rPr>
           <w:rFonts w:ascii="Times New Roman" w:eastAsia="Times New Roman" w:hAnsi="Times New Roman" w:cs="Times New Roman"/>
+          <w:noProof/>
           <w:sz w:val="24"/>
           <w:szCs w:val="24"/>
         </w:rPr>
-        <w:pict w14:anchorId="46C93DDF">
-          <v:rect id="_x0000_i1028" style="width:0;height:1.5pt" o:hrstd="t" o:hr="t" fillcolor="#a0a0a0" stroked="f"/>
+        <w:pict w14:anchorId="4410DF7B">
+          <v:rect id="_x0000_i1032" alt="" style="width:468pt;height:.05pt;mso-width-percent:0;mso-height-percent:0;mso-width-percent:0;mso-height-percent:0" o:hrstd="t" o:hr="t" fillcolor="#a0a0a0" stroked="f"/>
         </w:pict>
       </w:r>
     </w:p>
@@ -4469,11 +4473,12 @@
       <w:r>
         <w:rPr>
           <w:rFonts w:ascii="Times New Roman" w:eastAsia="Times New Roman" w:hAnsi="Times New Roman" w:cs="Times New Roman"/>
+          <w:noProof/>
           <w:sz w:val="24"/>
           <w:szCs w:val="24"/>
         </w:rPr>
-        <w:pict w14:anchorId="31576C6E">
-          <v:rect id="_x0000_i1029" style="width:0;height:1.5pt" o:hrstd="t" o:hr="t" fillcolor="#a0a0a0" stroked="f"/>
+        <w:pict w14:anchorId="2A7E8FF5">
+          <v:rect id="_x0000_i1031" alt="" style="width:468pt;height:.05pt;mso-width-percent:0;mso-height-percent:0;mso-width-percent:0;mso-height-percent:0" o:hrstd="t" o:hr="t" fillcolor="#a0a0a0" stroked="f"/>
         </w:pict>
       </w:r>
     </w:p>
@@ -4997,11 +5002,12 @@
       <w:r>
         <w:rPr>
           <w:rFonts w:ascii="Times New Roman" w:eastAsia="Times New Roman" w:hAnsi="Times New Roman" w:cs="Times New Roman"/>
+          <w:noProof/>
           <w:sz w:val="24"/>
           <w:szCs w:val="24"/>
         </w:rPr>
-        <w:pict w14:anchorId="01E77854">
-          <v:rect id="_x0000_i1030" style="width:0;height:1.5pt" o:hrstd="t" o:hr="t" fillcolor="#a0a0a0" stroked="f"/>
+        <w:pict w14:anchorId="64D03E0A">
+          <v:rect id="_x0000_i1030" alt="" style="width:468pt;height:.05pt;mso-width-percent:0;mso-height-percent:0;mso-width-percent:0;mso-height-percent:0" o:hrstd="t" o:hr="t" fillcolor="#a0a0a0" stroked="f"/>
         </w:pict>
       </w:r>
     </w:p>
@@ -5345,11 +5351,12 @@
       <w:r>
         <w:rPr>
           <w:rFonts w:ascii="Times New Roman" w:eastAsia="Times New Roman" w:hAnsi="Times New Roman" w:cs="Times New Roman"/>
+          <w:noProof/>
           <w:sz w:val="24"/>
           <w:szCs w:val="24"/>
         </w:rPr>
-        <w:pict w14:anchorId="27FFE31E">
-          <v:rect id="_x0000_i1031" style="width:0;height:1.5pt" o:hrstd="t" o:hr="t" fillcolor="#a0a0a0" stroked="f"/>
+        <w:pict w14:anchorId="380AEF08">
+          <v:rect id="_x0000_i1029" alt="" style="width:468pt;height:.05pt;mso-width-percent:0;mso-height-percent:0;mso-width-percent:0;mso-height-percent:0" o:hrstd="t" o:hr="t" fillcolor="#a0a0a0" stroked="f"/>
         </w:pict>
       </w:r>
     </w:p>
@@ -5981,11 +5988,12 @@
       <w:r>
         <w:rPr>
           <w:rFonts w:ascii="Times New Roman" w:eastAsia="Times New Roman" w:hAnsi="Times New Roman" w:cs="Times New Roman"/>
+          <w:noProof/>
           <w:sz w:val="24"/>
           <w:szCs w:val="24"/>
         </w:rPr>
-        <w:pict w14:anchorId="1EB8BD03">
-          <v:rect id="_x0000_i1032" style="width:0;height:1.5pt" o:hrstd="t" o:hr="t" fillcolor="#a0a0a0" stroked="f"/>
+        <w:pict w14:anchorId="6AD1D078">
+          <v:rect id="_x0000_i1028" alt="" style="width:468pt;height:.05pt;mso-width-percent:0;mso-height-percent:0;mso-width-percent:0;mso-height-percent:0" o:hrstd="t" o:hr="t" fillcolor="#a0a0a0" stroked="f"/>
         </w:pict>
       </w:r>
     </w:p>
@@ -7052,11 +7060,12 @@
       <w:r>
         <w:rPr>
           <w:rFonts w:ascii="Times New Roman" w:eastAsia="Times New Roman" w:hAnsi="Times New Roman" w:cs="Times New Roman"/>
+          <w:noProof/>
           <w:sz w:val="24"/>
           <w:szCs w:val="24"/>
         </w:rPr>
-        <w:pict w14:anchorId="3037CEAB">
-          <v:rect id="_x0000_i1033" style="width:0;height:1.5pt" o:hrstd="t" o:hr="t" fillcolor="#a0a0a0" stroked="f"/>
+        <w:pict w14:anchorId="08E77148">
+          <v:rect id="_x0000_i1027" alt="" style="width:468pt;height:.05pt;mso-width-percent:0;mso-height-percent:0;mso-width-percent:0;mso-height-percent:0" o:hrstd="t" o:hr="t" fillcolor="#a0a0a0" stroked="f"/>
         </w:pict>
       </w:r>
     </w:p>
@@ -8353,11 +8362,12 @@
       <w:r>
         <w:rPr>
           <w:rFonts w:ascii="Times New Roman" w:eastAsia="Times New Roman" w:hAnsi="Times New Roman" w:cs="Times New Roman"/>
+          <w:noProof/>
           <w:sz w:val="24"/>
           <w:szCs w:val="24"/>
         </w:rPr>
-        <w:pict w14:anchorId="680040E6">
-          <v:rect id="_x0000_i1034" style="width:0;height:1.5pt" o:hrstd="t" o:hr="t" fillcolor="#a0a0a0" stroked="f"/>
+        <w:pict w14:anchorId="68E3FC45">
+          <v:rect id="_x0000_i1026" alt="" style="width:468pt;height:.05pt;mso-width-percent:0;mso-height-percent:0;mso-width-percent:0;mso-height-percent:0" o:hrstd="t" o:hr="t" fillcolor="#a0a0a0" stroked="f"/>
         </w:pict>
       </w:r>
     </w:p>
@@ -8763,11 +8773,12 @@
       <w:r>
         <w:rPr>
           <w:rFonts w:ascii="Times New Roman" w:eastAsia="Times New Roman" w:hAnsi="Times New Roman" w:cs="Times New Roman"/>
+          <w:noProof/>
           <w:sz w:val="24"/>
           <w:szCs w:val="24"/>
         </w:rPr>
-        <w:pict w14:anchorId="6CC69C08">
-          <v:rect id="_x0000_i1035" style="width:0;height:1.5pt" o:hrstd="t" o:hr="t" fillcolor="#a0a0a0" stroked="f"/>
+        <w:pict w14:anchorId="0BAF0C04">
+          <v:rect id="_x0000_i1025" alt="" style="width:468pt;height:.05pt;mso-width-percent:0;mso-height-percent:0;mso-width-percent:0;mso-height-percent:0" o:hrstd="t" o:hr="t" fillcolor="#a0a0a0" stroked="f"/>
         </w:pict>
       </w:r>
     </w:p>
@@ -8911,6 +8922,19 @@
       </w:r>
     </w:p>
     <w:p/>
+    <w:p/>
+    <w:p/>
+    <w:p/>
+    <w:p/>
+    <w:p/>
+    <w:p>
+      <w:pPr>
+        <w:ind w:firstLine="720"/>
+      </w:pPr>
+      <w:r>
+        <w:t>https://github.com/Luly7/cs6460/tree/search</w:t>
+      </w:r>
+    </w:p>
     <w:sectPr>
       <w:pgSz w:w="12240" w:h="15840"/>
       <w:pgMar w:top="1440" w:right="1440" w:bottom="1440" w:left="1440" w:header="720" w:footer="720" w:gutter="0"/>

</xml_diff>